<commit_message>
docs: created BA-Docs folder and added Login Styling and Team Page Requirements document. Also edited some parts of the AI-Digital Marketing Master Document. Finally changed some security issues with js-yamal, nanoid and uuid.
</commit_message>
<xml_diff>
--- a/docs/Team38-AI_Digital_Marketing-TeamB_MASTER_DOCUMENT.docx
+++ b/docs/Team38-AI_Digital_Marketing-TeamB_MASTER_DOCUMENT.docx
@@ -43,7 +43,25 @@
           <w:bCs/>
           <w:color w:val="FF0000"/>
         </w:rPr>
-        <w:t>The git urls are fake – this is just an example</w:t>
+        <w:t xml:space="preserve">The git </w:t>
+      </w:r>
+      <w:proofErr w:type="spellStart"/>
+      <w:r>
+        <w:rPr>
+          <w:b/>
+          <w:bCs/>
+          <w:color w:val="FF0000"/>
+        </w:rPr>
+        <w:t>urls</w:t>
+      </w:r>
+      <w:proofErr w:type="spellEnd"/>
+      <w:r>
+        <w:rPr>
+          <w:b/>
+          <w:bCs/>
+          <w:color w:val="FF0000"/>
+        </w:rPr>
+        <w:t xml:space="preserve"> are fake – this is just an example</w:t>
       </w:r>
       <w:r>
         <w:br/>
@@ -188,13 +206,7 @@
               <w:rPr>
                 <w:color w:val="1E2761"/>
               </w:rPr>
-              <w:t>Wednesday</w:t>
-            </w:r>
-            <w:r>
-              <w:rPr>
-                <w:color w:val="1E2761"/>
-              </w:rPr>
-              <w:t xml:space="preserve">, </w:t>
+              <w:t xml:space="preserve">Wednesday, </w:t>
             </w:r>
             <w:r>
               <w:rPr>
@@ -237,7 +249,37 @@
         <w:t xml:space="preserve">Done: </w:t>
       </w:r>
       <w:r>
-        <w:t>Documented required fields for the team page (team name, project name, per-member photo/name/role, about-us blurb) and confirmed login work is styling-only, no auth logic changes.</w:t>
+        <w:t>Documented required fields for the team page (team name, project name, per-member photo/name/role, about-us blurb) and confirmed login work is</w:t>
+      </w:r>
+      <w:r>
+        <w:t xml:space="preserve"> visual </w:t>
+      </w:r>
+      <w:r>
+        <w:t>styling-only</w:t>
+      </w:r>
+      <w:r>
+        <w:t>.</w:t>
+      </w:r>
+      <w:r>
+        <w:t xml:space="preserve"> </w:t>
+      </w:r>
+      <w:r>
+        <w:t xml:space="preserve">There are </w:t>
+      </w:r>
+      <w:r>
+        <w:t>no auth</w:t>
+      </w:r>
+      <w:r>
+        <w:t>entication</w:t>
+      </w:r>
+      <w:r>
+        <w:t xml:space="preserve"> logic</w:t>
+      </w:r>
+      <w:r>
+        <w:t xml:space="preserve"> or login changes</w:t>
+      </w:r>
+      <w:r>
+        <w:t>.</w:t>
       </w:r>
     </w:p>
     <w:p>
@@ -252,7 +294,16 @@
         <w:t xml:space="preserve">Deliverable: </w:t>
       </w:r>
       <w:r>
-        <w:t>Requirements document, committed to the team repo.</w:t>
+        <w:t xml:space="preserve">Team Page and Login </w:t>
+      </w:r>
+      <w:r>
+        <w:t>Requirements document, committed to the team repo</w:t>
+      </w:r>
+      <w:r>
+        <w:t xml:space="preserve"> and on the Planner</w:t>
+      </w:r>
+      <w:r>
+        <w:t>.</w:t>
       </w:r>
     </w:p>
     <w:p>
@@ -283,13 +334,6 @@
           <w:color w:val="FFFFFF"/>
         </w:rPr>
         <w:t xml:space="preserve">Git URL:  </w:t>
-      </w:r>
-      <w:r>
-        <w:rPr>
-          <w:rFonts w:ascii="Consolas" w:eastAsia="Consolas" w:hAnsi="Consolas" w:cs="Consolas"/>
-          <w:color w:val="8FD3D6"/>
-        </w:rPr>
-        <w:t>https://github.com/team-byte-size/team-page/blob/main/docs/requirements.md</w:t>
       </w:r>
     </w:p>
     <w:p>
@@ -372,12 +416,14 @@
               </w:rPr>
               <w:t xml:space="preserve">UX — </w:t>
             </w:r>
+            <w:proofErr w:type="spellStart"/>
             <w:r>
               <w:rPr>
                 <w:color w:val="1E2761"/>
               </w:rPr>
               <w:t>ChungHeng</w:t>
             </w:r>
+            <w:proofErr w:type="spellEnd"/>
           </w:p>
         </w:tc>
         <w:tc>
@@ -420,25 +466,7 @@
               <w:rPr>
                 <w:color w:val="1E2761"/>
               </w:rPr>
-              <w:t>Thursday</w:t>
-            </w:r>
-            <w:r>
-              <w:rPr>
-                <w:color w:val="1E2761"/>
-              </w:rPr>
-              <w:t xml:space="preserve">, </w:t>
-            </w:r>
-            <w:r>
-              <w:rPr>
-                <w:color w:val="1E2761"/>
-              </w:rPr>
-              <w:t>13</w:t>
-            </w:r>
-            <w:r>
-              <w:rPr>
-                <w:color w:val="1E2761"/>
-              </w:rPr>
-              <w:t xml:space="preserve"> August 2026</w:t>
+              <w:t>Thursday, 13 August 2026</w:t>
             </w:r>
           </w:p>
         </w:tc>
@@ -469,7 +497,15 @@
         <w:t xml:space="preserve">Done: </w:t>
       </w:r>
       <w:r>
-        <w:t>Produced mockups for the restyled login page and the team page layout, including the placeholder-avatar and long-blurb cases BA flagged.</w:t>
+        <w:t xml:space="preserve">Produced </w:t>
+      </w:r>
+      <w:proofErr w:type="spellStart"/>
+      <w:r>
+        <w:t>mockups</w:t>
+      </w:r>
+      <w:proofErr w:type="spellEnd"/>
+      <w:r>
+        <w:t xml:space="preserve"> for the restyled login page and the team page layout, including the placeholder-avatar and long-blurb cases BA flagged.</w:t>
       </w:r>
     </w:p>
     <w:p>
@@ -725,7 +761,15 @@
         <w:t xml:space="preserve">Done: </w:t>
       </w:r>
       <w:r>
-        <w:t>Checked both mockups against the requirements doc. All fields present, login scope stayed to styling only, placeholder-avatar and long-blurb cases both covered. Approved as-is, no changes requested.</w:t>
+        <w:t xml:space="preserve">Checked both </w:t>
+      </w:r>
+      <w:proofErr w:type="spellStart"/>
+      <w:r>
+        <w:t>mockups</w:t>
+      </w:r>
+      <w:proofErr w:type="spellEnd"/>
+      <w:r>
+        <w:t xml:space="preserve"> against the requirements doc. All fields present, login scope stayed to styling only, placeholder-avatar and long-blurb cases both covered. Approved as-is, no changes requested.</w:t>
       </w:r>
     </w:p>
     <w:p>
@@ -939,7 +983,15 @@
         <w:t xml:space="preserve">Done: </w:t>
       </w:r>
       <w:r>
-        <w:t>Applied the approved login styling (colors, layout, branding). Confirmed auth logic, validation, and session handling are all untouched.</w:t>
+        <w:t>Applied the approved login styling (</w:t>
+      </w:r>
+      <w:proofErr w:type="spellStart"/>
+      <w:r>
+        <w:t>colors</w:t>
+      </w:r>
+      <w:proofErr w:type="spellEnd"/>
+      <w:r>
+        <w:t>, layout, branding). Confirmed auth logic, validation, and session handling are all untouched.</w:t>
       </w:r>
     </w:p>
     <w:p>
@@ -1864,8 +1916,18 @@
                 <w:iCs/>
                 <w:color w:val="888888"/>
               </w:rPr>
-              <w:t>[ IMAGE PLACEHOLDER — Invalid login error state screenshot — replace with actual screenshot ]</w:t>
-            </w:r>
+              <w:t xml:space="preserve">[ IMAGE PLACEHOLDER — Invalid login error state screenshot — replace with actual </w:t>
+            </w:r>
+            <w:proofErr w:type="gramStart"/>
+            <w:r>
+              <w:rPr>
+                <w:i/>
+                <w:iCs/>
+                <w:color w:val="888888"/>
+              </w:rPr>
+              <w:t>screenshot ]</w:t>
+            </w:r>
+            <w:proofErr w:type="gramEnd"/>
           </w:p>
         </w:tc>
       </w:tr>
@@ -3370,6 +3432,21 @@
 </file>
 
 <file path=customXml/item1.xml><?xml version="1.0" encoding="utf-8"?>
+<?mso-contentType ?>
+<FormTemplates xmlns="http://schemas.microsoft.com/sharepoint/v3/contenttype/forms">
+  <Display>DocumentLibraryForm</Display>
+  <Edit>DocumentLibraryForm</Edit>
+  <New>DocumentLibraryForm</New>
+</FormTemplates>
+</file>
+
+<file path=customXml/item2.xml><?xml version="1.0" encoding="utf-8"?>
+<p:properties xmlns:p="http://schemas.microsoft.com/office/2006/metadata/properties" xmlns:xsi="http://www.w3.org/2001/XMLSchema-instance" xmlns:pc="http://schemas.microsoft.com/office/infopath/2007/PartnerControls">
+  <documentManagement/>
+</p:properties>
+</file>
+
+<file path=customXml/item3.xml><?xml version="1.0" encoding="utf-8"?>
 <ct:contentTypeSchema xmlns:ct="http://schemas.microsoft.com/office/2006/metadata/contentType" xmlns:ma="http://schemas.microsoft.com/office/2006/metadata/properties/metaAttributes" ct:_="" ma:_="" ma:contentTypeName="Document" ma:contentTypeID="0x01010004C20B1CD48D284BABC6C352D5E28DB7" ma:contentTypeVersion="7" ma:contentTypeDescription="Create a new document." ma:contentTypeScope="" ma:versionID="f3993fb88598b4c5e5b876ac906abfd6">
   <xsd:schema xmlns:xsd="http://www.w3.org/2001/XMLSchema" xmlns:xs="http://www.w3.org/2001/XMLSchema" xmlns:p="http://schemas.microsoft.com/office/2006/metadata/properties" xmlns:ns2="6e42dba8-6eae-49c7-9a4f-25c44bf58762" targetNamespace="http://schemas.microsoft.com/office/2006/metadata/properties" ma:root="true" ma:fieldsID="68622942824b81d9959e3a3bb0dd1c86" ns2:_="">
     <xsd:import namespace="6e42dba8-6eae-49c7-9a4f-25c44bf58762"/>
@@ -3531,22 +3608,24 @@
 </ct:contentTypeSchema>
 </file>
 
-<file path=customXml/item2.xml><?xml version="1.0" encoding="utf-8"?>
-<p:properties xmlns:p="http://schemas.microsoft.com/office/2006/metadata/properties" xmlns:xsi="http://www.w3.org/2001/XMLSchema-instance" xmlns:pc="http://schemas.microsoft.com/office/infopath/2007/PartnerControls">
-  <documentManagement/>
-</p:properties>
+<file path=customXml/itemProps1.xml><?xml version="1.0" encoding="utf-8"?>
+<ds:datastoreItem xmlns:ds="http://schemas.openxmlformats.org/officeDocument/2006/customXml" ds:itemID="{F1CC0820-7030-4A87-BCBE-6174B93C7B40}">
+  <ds:schemaRefs>
+    <ds:schemaRef ds:uri="http://schemas.microsoft.com/sharepoint/v3/contenttype/forms"/>
+  </ds:schemaRefs>
+</ds:datastoreItem>
 </file>
 
-<file path=customXml/item3.xml><?xml version="1.0" encoding="utf-8"?>
-<?mso-contentType ?>
-<FormTemplates xmlns="http://schemas.microsoft.com/sharepoint/v3/contenttype/forms">
-  <Display>DocumentLibraryForm</Display>
-  <Edit>DocumentLibraryForm</Edit>
-  <New>DocumentLibraryForm</New>
-</FormTemplates>
+<file path=customXml/itemProps2.xml><?xml version="1.0" encoding="utf-8"?>
+<ds:datastoreItem xmlns:ds="http://schemas.openxmlformats.org/officeDocument/2006/customXml" ds:itemID="{9D7F2ABC-FBDF-4EC4-A8F5-138427A7805D}">
+  <ds:schemaRefs>
+    <ds:schemaRef ds:uri="http://schemas.microsoft.com/office/2006/metadata/properties"/>
+    <ds:schemaRef ds:uri="http://schemas.microsoft.com/office/infopath/2007/PartnerControls"/>
+  </ds:schemaRefs>
+</ds:datastoreItem>
 </file>
 
-<file path=customXml/itemProps1.xml><?xml version="1.0" encoding="utf-8"?>
+<file path=customXml/itemProps3.xml><?xml version="1.0" encoding="utf-8"?>
 <ds:datastoreItem xmlns:ds="http://schemas.openxmlformats.org/officeDocument/2006/customXml" ds:itemID="{325418D3-B9C5-4AC2-948A-B5A9266747D7}">
   <ds:schemaRefs>
     <ds:schemaRef ds:uri="http://schemas.microsoft.com/office/2006/metadata/contentType"/>
@@ -3564,23 +3643,6 @@
 </ds:datastoreItem>
 </file>
 
-<file path=customXml/itemProps2.xml><?xml version="1.0" encoding="utf-8"?>
-<ds:datastoreItem xmlns:ds="http://schemas.openxmlformats.org/officeDocument/2006/customXml" ds:itemID="{9D7F2ABC-FBDF-4EC4-A8F5-138427A7805D}">
-  <ds:schemaRefs>
-    <ds:schemaRef ds:uri="http://schemas.microsoft.com/office/2006/metadata/properties"/>
-    <ds:schemaRef ds:uri="http://schemas.microsoft.com/office/infopath/2007/PartnerControls"/>
-  </ds:schemaRefs>
-</ds:datastoreItem>
-</file>
-
-<file path=customXml/itemProps3.xml><?xml version="1.0" encoding="utf-8"?>
-<ds:datastoreItem xmlns:ds="http://schemas.openxmlformats.org/officeDocument/2006/customXml" ds:itemID="{F1CC0820-7030-4A87-BCBE-6174B93C7B40}">
-  <ds:schemaRefs>
-    <ds:schemaRef ds:uri="http://schemas.microsoft.com/sharepoint/v3/contenttype/forms"/>
-  </ds:schemaRefs>
-</ds:datastoreItem>
-</file>
-
 <file path=docMetadata/LabelInfo.xml><?xml version="1.0" encoding="utf-8"?>
 <clbl:labelList xmlns:clbl="http://schemas.microsoft.com/office/2020/mipLabelMetadata">
   <clbl:label id="{ddaa77bc-0157-46a4-82a6-8fc765694bc9}" enabled="1" method="Standard" siteId="{d1323671-cdbe-4417-b4d4-bdb24b51316b}" contentBits="0" removed="0"/>

</xml_diff>

<commit_message>
docs: changed naming of docs and added UX validation
</commit_message>
<xml_diff>
--- a/docs/Team38-AI_Digital_Marketing-TeamB_MASTER_DOCUMENT.docx
+++ b/docs/Team38-AI_Digital_Marketing-TeamB_MASTER_DOCUMENT.docx
@@ -249,37 +249,7 @@
         <w:t xml:space="preserve">Done: </w:t>
       </w:r>
       <w:r>
-        <w:t>Documented required fields for the team page (team name, project name, per-member photo/name/role, about-us blurb) and confirmed login work is</w:t>
-      </w:r>
-      <w:r>
-        <w:t xml:space="preserve"> visual </w:t>
-      </w:r>
-      <w:r>
-        <w:t>styling-only</w:t>
-      </w:r>
-      <w:r>
-        <w:t>.</w:t>
-      </w:r>
-      <w:r>
-        <w:t xml:space="preserve"> </w:t>
-      </w:r>
-      <w:r>
-        <w:t xml:space="preserve">There are </w:t>
-      </w:r>
-      <w:r>
-        <w:t>no auth</w:t>
-      </w:r>
-      <w:r>
-        <w:t>entication</w:t>
-      </w:r>
-      <w:r>
-        <w:t xml:space="preserve"> logic</w:t>
-      </w:r>
-      <w:r>
-        <w:t xml:space="preserve"> or login changes</w:t>
-      </w:r>
-      <w:r>
-        <w:t>.</w:t>
+        <w:t>Documented and determined the content fields for the team page (name, photo, role, blurb) and confirmed the login work is styling only, with no changes to existing authentication logic, session behaviour and validation. Also documented edge cases such as missing or broken photos, long blurb text and additional team members.</w:t>
       </w:r>
     </w:p>
     <w:p>
@@ -294,16 +264,21 @@
         <w:t xml:space="preserve">Deliverable: </w:t>
       </w:r>
       <w:r>
-        <w:t xml:space="preserve">Team Page and Login </w:t>
-      </w:r>
-      <w:r>
-        <w:t>Requirements document, committed to the team repo</w:t>
-      </w:r>
-      <w:r>
-        <w:t xml:space="preserve"> and on the Planner</w:t>
-      </w:r>
-      <w:r>
-        <w:t>.</w:t>
+        <w:t xml:space="preserve">Login Styling and Team Page Requirements document. Document has been committed to the repo in the 'BA-Docs' </w:t>
+      </w:r>
+      <w:proofErr w:type="gramStart"/>
+      <w:r>
+        <w:t>folder</w:t>
+      </w:r>
+      <w:proofErr w:type="gramEnd"/>
+      <w:r>
+        <w:t xml:space="preserve"> and it is also linked </w:t>
+      </w:r>
+      <w:r>
+        <w:t>in</w:t>
+      </w:r>
+      <w:r>
+        <w:t xml:space="preserve"> the team Planner.</w:t>
       </w:r>
     </w:p>
     <w:p>
@@ -318,7 +293,13 @@
         <w:t xml:space="preserve">Note for next role: </w:t>
       </w:r>
       <w:r>
-        <w:t>UX — we have 5 team members, one doesn't have a headshot yet, so the design needs a placeholder-avatar treatment. Two members also have longer blurbs, so don't assume a one-line blurb.</w:t>
+        <w:t xml:space="preserve">One additional person has </w:t>
+      </w:r>
+      <w:r>
+        <w:t>joined</w:t>
+      </w:r>
+      <w:r>
+        <w:t xml:space="preserve"> the team so make 5 sections for team members.</w:t>
       </w:r>
     </w:p>
     <w:p>
@@ -730,7 +711,25 @@
               <w:rPr>
                 <w:color w:val="1E2761"/>
               </w:rPr>
-              <w:t>Tuesday, 4 August 2026</w:t>
+              <w:t>Friday</w:t>
+            </w:r>
+            <w:r>
+              <w:rPr>
+                <w:color w:val="1E2761"/>
+              </w:rPr>
+              <w:t xml:space="preserve">, </w:t>
+            </w:r>
+            <w:r>
+              <w:rPr>
+                <w:color w:val="1E2761"/>
+              </w:rPr>
+              <w:t>1</w:t>
+            </w:r>
+            <w:r>
+              <w:rPr>
+                <w:color w:val="1E2761"/>
+              </w:rPr>
+              <w:t>4 August 2026</w:t>
             </w:r>
           </w:p>
         </w:tc>
@@ -761,7 +760,7 @@
         <w:t xml:space="preserve">Done: </w:t>
       </w:r>
       <w:r>
-        <w:t xml:space="preserve">Checked both </w:t>
+        <w:t xml:space="preserve">Checked the UX </w:t>
       </w:r>
       <w:proofErr w:type="spellStart"/>
       <w:r>
@@ -769,7 +768,15 @@
       </w:r>
       <w:proofErr w:type="spellEnd"/>
       <w:r>
-        <w:t xml:space="preserve"> against the requirements doc. All fields present, login scope stayed to styling only, placeholder-avatar and long-blurb cases both covered. Approved as-is, no changes requested.</w:t>
+        <w:t xml:space="preserve"> against the requirements document. Confirm every field is represented, the login </w:t>
+      </w:r>
+      <w:proofErr w:type="spellStart"/>
+      <w:r>
+        <w:t>mockup</w:t>
+      </w:r>
+      <w:proofErr w:type="spellEnd"/>
+      <w:r>
+        <w:t xml:space="preserve"> stays styling-only, and edge cases have a visible design treatment. Flagged any gaps back to UX before approval</w:t>
       </w:r>
     </w:p>
     <w:p>
@@ -784,7 +791,19 @@
         <w:t xml:space="preserve">Deliverable: </w:t>
       </w:r>
       <w:r>
-        <w:t>Design validation sign-off, committed to the team repo.</w:t>
+        <w:t xml:space="preserve">Created validation document. Committed to team repo </w:t>
+      </w:r>
+      <w:r>
+        <w:t>and</w:t>
+      </w:r>
+      <w:r>
+        <w:t xml:space="preserve"> linked in the </w:t>
+      </w:r>
+      <w:r>
+        <w:t xml:space="preserve">team </w:t>
+      </w:r>
+      <w:r>
+        <w:t>Planner.</w:t>
       </w:r>
     </w:p>
     <w:p>
@@ -799,7 +818,7 @@
         <w:t xml:space="preserve">Note for next role: </w:t>
       </w:r>
       <w:r>
-        <w:t>Dev — you're clear to build exactly to the Figma file, no open questions from BA's side.</w:t>
+        <w:t>Devs, you're clear to build according to the design file, no open questions from BA's side.</w:t>
       </w:r>
     </w:p>
     <w:p>
@@ -2907,7 +2926,6 @@
   <w:style w:type="character" w:default="1" w:styleId="DefaultParagraphFont">
     <w:name w:val="Default Paragraph Font"/>
     <w:uiPriority w:val="1"/>
-    <w:semiHidden/>
     <w:unhideWhenUsed/>
   </w:style>
   <w:style w:type="table" w:default="1" w:styleId="TableNormal">
@@ -3432,21 +3450,6 @@
 </file>
 
 <file path=customXml/item1.xml><?xml version="1.0" encoding="utf-8"?>
-<?mso-contentType ?>
-<FormTemplates xmlns="http://schemas.microsoft.com/sharepoint/v3/contenttype/forms">
-  <Display>DocumentLibraryForm</Display>
-  <Edit>DocumentLibraryForm</Edit>
-  <New>DocumentLibraryForm</New>
-</FormTemplates>
-</file>
-
-<file path=customXml/item2.xml><?xml version="1.0" encoding="utf-8"?>
-<p:properties xmlns:p="http://schemas.microsoft.com/office/2006/metadata/properties" xmlns:xsi="http://www.w3.org/2001/XMLSchema-instance" xmlns:pc="http://schemas.microsoft.com/office/infopath/2007/PartnerControls">
-  <documentManagement/>
-</p:properties>
-</file>
-
-<file path=customXml/item3.xml><?xml version="1.0" encoding="utf-8"?>
 <ct:contentTypeSchema xmlns:ct="http://schemas.microsoft.com/office/2006/metadata/contentType" xmlns:ma="http://schemas.microsoft.com/office/2006/metadata/properties/metaAttributes" ct:_="" ma:_="" ma:contentTypeName="Document" ma:contentTypeID="0x01010004C20B1CD48D284BABC6C352D5E28DB7" ma:contentTypeVersion="7" ma:contentTypeDescription="Create a new document." ma:contentTypeScope="" ma:versionID="f3993fb88598b4c5e5b876ac906abfd6">
   <xsd:schema xmlns:xsd="http://www.w3.org/2001/XMLSchema" xmlns:xs="http://www.w3.org/2001/XMLSchema" xmlns:p="http://schemas.microsoft.com/office/2006/metadata/properties" xmlns:ns2="6e42dba8-6eae-49c7-9a4f-25c44bf58762" targetNamespace="http://schemas.microsoft.com/office/2006/metadata/properties" ma:root="true" ma:fieldsID="68622942824b81d9959e3a3bb0dd1c86" ns2:_="">
     <xsd:import namespace="6e42dba8-6eae-49c7-9a4f-25c44bf58762"/>
@@ -3608,24 +3611,22 @@
 </ct:contentTypeSchema>
 </file>
 
-<file path=customXml/itemProps1.xml><?xml version="1.0" encoding="utf-8"?>
-<ds:datastoreItem xmlns:ds="http://schemas.openxmlformats.org/officeDocument/2006/customXml" ds:itemID="{F1CC0820-7030-4A87-BCBE-6174B93C7B40}">
-  <ds:schemaRefs>
-    <ds:schemaRef ds:uri="http://schemas.microsoft.com/sharepoint/v3/contenttype/forms"/>
-  </ds:schemaRefs>
-</ds:datastoreItem>
+<file path=customXml/item2.xml><?xml version="1.0" encoding="utf-8"?>
+<p:properties xmlns:p="http://schemas.microsoft.com/office/2006/metadata/properties" xmlns:xsi="http://www.w3.org/2001/XMLSchema-instance" xmlns:pc="http://schemas.microsoft.com/office/infopath/2007/PartnerControls">
+  <documentManagement/>
+</p:properties>
 </file>
 
-<file path=customXml/itemProps2.xml><?xml version="1.0" encoding="utf-8"?>
-<ds:datastoreItem xmlns:ds="http://schemas.openxmlformats.org/officeDocument/2006/customXml" ds:itemID="{9D7F2ABC-FBDF-4EC4-A8F5-138427A7805D}">
-  <ds:schemaRefs>
-    <ds:schemaRef ds:uri="http://schemas.microsoft.com/office/2006/metadata/properties"/>
-    <ds:schemaRef ds:uri="http://schemas.microsoft.com/office/infopath/2007/PartnerControls"/>
-  </ds:schemaRefs>
-</ds:datastoreItem>
+<file path=customXml/item3.xml><?xml version="1.0" encoding="utf-8"?>
+<?mso-contentType ?>
+<FormTemplates xmlns="http://schemas.microsoft.com/sharepoint/v3/contenttype/forms">
+  <Display>DocumentLibraryForm</Display>
+  <Edit>DocumentLibraryForm</Edit>
+  <New>DocumentLibraryForm</New>
+</FormTemplates>
 </file>
 
-<file path=customXml/itemProps3.xml><?xml version="1.0" encoding="utf-8"?>
+<file path=customXml/itemProps1.xml><?xml version="1.0" encoding="utf-8"?>
 <ds:datastoreItem xmlns:ds="http://schemas.openxmlformats.org/officeDocument/2006/customXml" ds:itemID="{325418D3-B9C5-4AC2-948A-B5A9266747D7}">
   <ds:schemaRefs>
     <ds:schemaRef ds:uri="http://schemas.microsoft.com/office/2006/metadata/contentType"/>
@@ -3643,6 +3644,23 @@
 </ds:datastoreItem>
 </file>
 
+<file path=customXml/itemProps2.xml><?xml version="1.0" encoding="utf-8"?>
+<ds:datastoreItem xmlns:ds="http://schemas.openxmlformats.org/officeDocument/2006/customXml" ds:itemID="{9D7F2ABC-FBDF-4EC4-A8F5-138427A7805D}">
+  <ds:schemaRefs>
+    <ds:schemaRef ds:uri="http://schemas.microsoft.com/office/2006/metadata/properties"/>
+    <ds:schemaRef ds:uri="http://schemas.microsoft.com/office/infopath/2007/PartnerControls"/>
+  </ds:schemaRefs>
+</ds:datastoreItem>
+</file>
+
+<file path=customXml/itemProps3.xml><?xml version="1.0" encoding="utf-8"?>
+<ds:datastoreItem xmlns:ds="http://schemas.openxmlformats.org/officeDocument/2006/customXml" ds:itemID="{F1CC0820-7030-4A87-BCBE-6174B93C7B40}">
+  <ds:schemaRefs>
+    <ds:schemaRef ds:uri="http://schemas.microsoft.com/sharepoint/v3/contenttype/forms"/>
+  </ds:schemaRefs>
+</ds:datastoreItem>
+</file>
+
 <file path=docMetadata/LabelInfo.xml><?xml version="1.0" encoding="utf-8"?>
 <clbl:labelList xmlns:clbl="http://schemas.microsoft.com/office/2020/mipLabelMetadata">
   <clbl:label id="{ddaa77bc-0157-46a4-82a6-8fc765694bc9}" enabled="1" method="Standard" siteId="{d1323671-cdbe-4417-b4d4-bdb24b51316b}" contentBits="0" removed="0"/>

</xml_diff>